<commit_message>
revert(_lib/db): возврат к простому export const sql = neon(url)
Lazy-init функция в проде давала FUNCTION_INVOCATION_FAILED — Vercel,
видимо, по-особому компилирует generic-функции с tagged-template
сигнатурой. Env-переменные в Vercel уже настроены (health подтвердил),
поэтому исходная eager-инициализация безопасна и работает.
</commit_message>
<xml_diff>
--- a/Проектная работа Абдуллаев И.docx
+++ b/Проектная работа Абдуллаев И.docx
@@ -3190,21 +3190,48 @@
     </w:p>
     <w:p>
       <w:pPr>
+        <w:spacing w:before="120" w:after="0"/>
         <w:ind w:firstLine="0"/>
         <w:jc w:val="center"/>
       </w:pPr>
       <w:r>
-        <w:rPr>
-          <w:rFonts w:ascii="Times New Roman" w:hAnsi="Times New Roman" w:eastAsia="Times New Roman" w:cs="Times New Roman"/>
-          <w:b w:val="0"/>
-          <w:i/>
-          <w:sz w:val="28"/>
-        </w:rPr>
-        <w:t>[ВСТАВИТЬ РИС.: Архитектурная схема системы — docs/architecture.png]</w:t>
+        <w:drawing>
+          <wp:inline xmlns:a="http://schemas.openxmlformats.org/drawingml/2006/main" xmlns:pic="http://schemas.openxmlformats.org/drawingml/2006/picture">
+            <wp:extent cx="5760000" cy="3019882"/>
+            <wp:docPr id="1" name="Picture 1"/>
+            <wp:cNvGraphicFramePr>
+              <a:graphicFrameLocks noChangeAspect="1"/>
+            </wp:cNvGraphicFramePr>
+            <a:graphic>
+              <a:graphicData uri="http://schemas.openxmlformats.org/drawingml/2006/picture">
+                <pic:pic>
+                  <pic:nvPicPr>
+                    <pic:cNvPr id="0" name="architecture.png"/>
+                    <pic:cNvPicPr/>
+                  </pic:nvPicPr>
+                  <pic:blipFill>
+                    <a:blip r:embed="rId17"/>
+                    <a:stretch>
+                      <a:fillRect/>
+                    </a:stretch>
+                  </pic:blipFill>
+                  <pic:spPr>
+                    <a:xfrm>
+                      <a:off x="0" y="0"/>
+                      <a:ext cx="5760000" cy="3019882"/>
+                    </a:xfrm>
+                    <a:prstGeom prst="rect"/>
+                  </pic:spPr>
+                </pic:pic>
+              </a:graphicData>
+            </a:graphic>
+          </wp:inline>
+        </w:drawing>
       </w:r>
     </w:p>
     <w:p>
       <w:pPr>
+        <w:spacing w:line="240" w:lineRule="auto" w:before="0" w:after="240"/>
         <w:ind w:firstLine="0"/>
         <w:jc w:val="center"/>
       </w:pPr>
@@ -3217,11 +3244,6 @@
         </w:rPr>
         <w:t>Рис. 1. Архитектурная схема системы</w:t>
       </w:r>
-    </w:p>
-    <w:p>
-      <w:pPr>
-        <w:ind w:firstLine="0"/>
-      </w:pPr>
     </w:p>
     <w:p>
       <w:r>
@@ -3403,21 +3425,48 @@
     </w:p>
     <w:p>
       <w:pPr>
+        <w:spacing w:before="120" w:after="0"/>
         <w:ind w:firstLine="0"/>
         <w:jc w:val="center"/>
       </w:pPr>
       <w:r>
-        <w:rPr>
-          <w:rFonts w:ascii="Times New Roman" w:hAnsi="Times New Roman" w:eastAsia="Times New Roman" w:cs="Times New Roman"/>
-          <w:b w:val="0"/>
-          <w:i/>
-          <w:sz w:val="28"/>
-        </w:rPr>
-        <w:t>[ВСТАВИТЬ РИС.: ER-диаграмма базы данных — docs/er-diagram.png]</w:t>
+        <w:drawing>
+          <wp:inline xmlns:a="http://schemas.openxmlformats.org/drawingml/2006/main" xmlns:pic="http://schemas.openxmlformats.org/drawingml/2006/picture">
+            <wp:extent cx="5760000" cy="2199011"/>
+            <wp:docPr id="2" name="Picture 2"/>
+            <wp:cNvGraphicFramePr>
+              <a:graphicFrameLocks noChangeAspect="1"/>
+            </wp:cNvGraphicFramePr>
+            <a:graphic>
+              <a:graphicData uri="http://schemas.openxmlformats.org/drawingml/2006/picture">
+                <pic:pic>
+                  <pic:nvPicPr>
+                    <pic:cNvPr id="0" name="er-diagram.png"/>
+                    <pic:cNvPicPr/>
+                  </pic:nvPicPr>
+                  <pic:blipFill>
+                    <a:blip r:embed="rId18"/>
+                    <a:stretch>
+                      <a:fillRect/>
+                    </a:stretch>
+                  </pic:blipFill>
+                  <pic:spPr>
+                    <a:xfrm>
+                      <a:off x="0" y="0"/>
+                      <a:ext cx="5760000" cy="2199011"/>
+                    </a:xfrm>
+                    <a:prstGeom prst="rect"/>
+                  </pic:spPr>
+                </pic:pic>
+              </a:graphicData>
+            </a:graphic>
+          </wp:inline>
+        </w:drawing>
       </w:r>
     </w:p>
     <w:p>
       <w:pPr>
+        <w:spacing w:line="240" w:lineRule="auto" w:before="0" w:after="240"/>
         <w:ind w:firstLine="0"/>
         <w:jc w:val="center"/>
       </w:pPr>
@@ -3430,11 +3479,6 @@
         </w:rPr>
         <w:t>Рис. 2. Логическая ER-диаграмма базы данных</w:t>
       </w:r>
-    </w:p>
-    <w:p>
-      <w:pPr>
-        <w:ind w:firstLine="0"/>
-      </w:pPr>
     </w:p>
     <w:p>
       <w:pPr>
@@ -3463,21 +3507,48 @@
     </w:p>
     <w:p>
       <w:pPr>
+        <w:spacing w:before="120" w:after="0"/>
         <w:ind w:firstLine="0"/>
         <w:jc w:val="center"/>
       </w:pPr>
       <w:r>
-        <w:rPr>
-          <w:rFonts w:ascii="Times New Roman" w:hAnsi="Times New Roman" w:eastAsia="Times New Roman" w:cs="Times New Roman"/>
-          <w:b w:val="0"/>
-          <w:i/>
-          <w:sz w:val="28"/>
-        </w:rPr>
-        <w:t>[ВСТАВИТЬ РИС.: Диаграмма состояний подписки — docs/subscription-lifecycle.png]</w:t>
+        <w:drawing>
+          <wp:inline xmlns:a="http://schemas.openxmlformats.org/drawingml/2006/main" xmlns:pic="http://schemas.openxmlformats.org/drawingml/2006/picture">
+            <wp:extent cx="5760000" cy="1946832"/>
+            <wp:docPr id="3" name="Picture 3"/>
+            <wp:cNvGraphicFramePr>
+              <a:graphicFrameLocks noChangeAspect="1"/>
+            </wp:cNvGraphicFramePr>
+            <a:graphic>
+              <a:graphicData uri="http://schemas.openxmlformats.org/drawingml/2006/picture">
+                <pic:pic>
+                  <pic:nvPicPr>
+                    <pic:cNvPr id="0" name="subscription-lifecycle.png"/>
+                    <pic:cNvPicPr/>
+                  </pic:nvPicPr>
+                  <pic:blipFill>
+                    <a:blip r:embed="rId19"/>
+                    <a:stretch>
+                      <a:fillRect/>
+                    </a:stretch>
+                  </pic:blipFill>
+                  <pic:spPr>
+                    <a:xfrm>
+                      <a:off x="0" y="0"/>
+                      <a:ext cx="5760000" cy="1946832"/>
+                    </a:xfrm>
+                    <a:prstGeom prst="rect"/>
+                  </pic:spPr>
+                </pic:pic>
+              </a:graphicData>
+            </a:graphic>
+          </wp:inline>
+        </w:drawing>
       </w:r>
     </w:p>
     <w:p>
       <w:pPr>
+        <w:spacing w:line="240" w:lineRule="auto" w:before="0" w:after="240"/>
         <w:ind w:firstLine="0"/>
         <w:jc w:val="center"/>
       </w:pPr>
@@ -3490,11 +3561,6 @@
         </w:rPr>
         <w:t>Рис. 3. Диаграмма состояний подписки</w:t>
       </w:r>
-    </w:p>
-    <w:p>
-      <w:pPr>
-        <w:ind w:firstLine="0"/>
-      </w:pPr>
     </w:p>
     <w:p>
       <w:pPr>
@@ -3530,6 +3596,1345 @@
           <w:sz w:val="28"/>
         </w:rPr>
         <w:t>Контроль доступа к PDF-номерам реализован на стороне сервера. При запросе ссылки на файл бессерверная функция проверяет наличие записи в таблице subscriptions с текущим user_id, заданным publication_id, статусом active и end_date не ранее текущей даты. При отсутствии такой записи функция возвращает HTTP-код 403. Этот механизм исключает обход подписки прямой ссылкой на файл.</w:t>
+      </w:r>
+    </w:p>
+    <w:p>
+      <w:pPr>
+        <w:pStyle w:val="Heading1"/>
+        <w:jc w:val="center"/>
+      </w:pPr>
+      <w:r>
+        <w:rPr>
+          <w:rFonts w:ascii="Times New Roman" w:hAnsi="Times New Roman" w:eastAsia="Times New Roman" w:cs="Times New Roman"/>
+          <w:b/>
+          <w:i w:val="0"/>
+          <w:sz w:val="28"/>
+        </w:rPr>
+        <w:t>4. ПРАКТИЧЕСКАЯ ЧАСТЬ. РЕАЛИЗАЦИЯ СИСТЕМЫ</w:t>
+      </w:r>
+    </w:p>
+    <w:p>
+      <w:pPr>
+        <w:pStyle w:val="Heading2"/>
+      </w:pPr>
+      <w:r>
+        <w:rPr>
+          <w:rFonts w:ascii="Times New Roman" w:hAnsi="Times New Roman" w:eastAsia="Times New Roman" w:cs="Times New Roman"/>
+          <w:b/>
+          <w:i w:val="0"/>
+          <w:sz w:val="28"/>
+        </w:rPr>
+        <w:t>4.1. Развёртывание и конфигурация</w:t>
+      </w:r>
+    </w:p>
+    <w:p>
+      <w:r>
+        <w:rPr>
+          <w:rFonts w:ascii="Times New Roman" w:hAnsi="Times New Roman" w:eastAsia="Times New Roman" w:cs="Times New Roman"/>
+          <w:b w:val="0"/>
+          <w:i w:val="0"/>
+          <w:sz w:val="28"/>
+        </w:rPr>
+        <w:t>Готовое приложение развёрнуто на платформе Vercel и доступно по адресу https://ilhom-oj9x.vercel.app/. Серверная часть размещена в директории /api проекта и собирается платформой автоматически в виде бессерверных функций. Клиентская часть собирается командой vite build и раздаётся через сеть доставки контента провайдера. Платформенные секреты — строка подключения к Neon PostgreSQL, токен доступа к Vercel Blob и секретный ключ для подписи JSON Web Token — заданы в переменных окружения проекта на стороне Vercel, что соответствует рекомендациям по безопасной конфигурации облачных приложений [9] [11].</w:t>
+      </w:r>
+    </w:p>
+    <w:p>
+      <w:r>
+        <w:rPr>
+          <w:rFonts w:ascii="Times New Roman" w:hAnsi="Times New Roman" w:eastAsia="Times New Roman" w:cs="Times New Roman"/>
+          <w:b w:val="0"/>
+          <w:i w:val="0"/>
+          <w:sz w:val="28"/>
+        </w:rPr>
+        <w:t>Локальная разработка ведётся командой npm run dev, под которой запускается сервер Vite для клиента и эмулятор бессерверных функций. Миграции базы данных выполняются скриптом db/migrate.ts, который последовательно применяет файлы schema.sql и seed.sql. Этот же скрипт используется при первичной настройке окружения перед демонстрационным прогоном системы.</w:t>
+      </w:r>
+    </w:p>
+    <w:p>
+      <w:pPr>
+        <w:pStyle w:val="Heading2"/>
+      </w:pPr>
+      <w:r>
+        <w:rPr>
+          <w:rFonts w:ascii="Times New Roman" w:hAnsi="Times New Roman" w:eastAsia="Times New Roman" w:cs="Times New Roman"/>
+          <w:b/>
+          <w:i w:val="0"/>
+          <w:sz w:val="28"/>
+        </w:rPr>
+        <w:t>4.2. Публичная часть приложения</w:t>
+      </w:r>
+    </w:p>
+    <w:p>
+      <w:pPr>
+        <w:ind w:firstLine="709"/>
+      </w:pPr>
+      <w:r>
+        <w:rPr>
+          <w:rFonts w:ascii="Times New Roman" w:hAnsi="Times New Roman" w:eastAsia="Times New Roman" w:cs="Times New Roman"/>
+          <w:b w:val="0"/>
+          <w:i w:val="0"/>
+          <w:sz w:val="28"/>
+        </w:rPr>
+        <w:t>Публичная часть доступна без авторизации и предназначена для знакомства пользователя с системой и принятия решения об оформлении подписки. В состав публичной части входят главная страница, каталог изданий, карточка отдельного издания, формы регистрации и входа.</w:t>
+      </w:r>
+    </w:p>
+    <w:p>
+      <w:pPr>
+        <w:ind w:firstLine="709"/>
+      </w:pPr>
+      <w:r>
+        <w:rPr>
+          <w:rFonts w:ascii="Times New Roman" w:hAnsi="Times New Roman" w:eastAsia="Times New Roman" w:cs="Times New Roman"/>
+          <w:b w:val="0"/>
+          <w:i w:val="0"/>
+          <w:sz w:val="28"/>
+        </w:rPr>
+        <w:t>Главная страница приложения построена в виде газетного разворота и содержит баннер с краткой ценностью сервиса, блок популярных изданий и блок категорий с переходом в каталог. Цветовая палитра использует «бумажный» фон, тёмно-красный акцент и засечную типографику Playfair Display в заголовках, что визуально отсылает к печатной прессе. Внешний вид главной страницы приведён на рисунке 4.</w:t>
+      </w:r>
+    </w:p>
+    <w:p>
+      <w:pPr>
+        <w:spacing w:before="120" w:after="0"/>
+        <w:ind w:firstLine="0"/>
+        <w:jc w:val="center"/>
+      </w:pPr>
+      <w:r>
+        <w:rPr>
+          <w:rFonts w:ascii="Times New Roman" w:hAnsi="Times New Roman" w:eastAsia="Times New Roman" w:cs="Times New Roman"/>
+          <w:b w:val="0"/>
+          <w:i/>
+          <w:sz w:val="24"/>
+        </w:rPr>
+        <w:t>[ВСТАВИТЬ РИСУНОК: 01-home.png]</w:t>
+      </w:r>
+    </w:p>
+    <w:p>
+      <w:pPr>
+        <w:spacing w:line="240" w:lineRule="auto" w:before="0" w:after="240"/>
+        <w:ind w:firstLine="0"/>
+        <w:jc w:val="center"/>
+      </w:pPr>
+      <w:r>
+        <w:rPr>
+          <w:rFonts w:ascii="Times New Roman" w:hAnsi="Times New Roman" w:eastAsia="Times New Roman" w:cs="Times New Roman"/>
+          <w:b w:val="0"/>
+          <w:i w:val="0"/>
+          <w:sz w:val="24"/>
+        </w:rPr>
+        <w:t>Рис. 4. Главная страница приложения</w:t>
+      </w:r>
+    </w:p>
+    <w:p>
+      <w:r>
+        <w:rPr>
+          <w:rFonts w:ascii="Times New Roman" w:hAnsi="Times New Roman" w:eastAsia="Times New Roman" w:cs="Times New Roman"/>
+          <w:b w:val="0"/>
+          <w:i w:val="0"/>
+          <w:sz w:val="28"/>
+        </w:rPr>
+        <w:t>Каталог изданий реализует фильтрацию по категории и типу издания (газета или журнал), сортировку по популярности и цене, а также пагинацию. Список загружается запросом GET /api/publications с параметрами category, type, sort и page. На стороне сервера выполняется параметризованный SQL-запрос с фильтрацией по category_id и type, сортировкой и ограничением выборки. Внешний вид каталога с активным фильтром приведён на рисунке 5.</w:t>
+      </w:r>
+    </w:p>
+    <w:p>
+      <w:pPr>
+        <w:spacing w:before="120" w:after="0"/>
+        <w:ind w:firstLine="0"/>
+        <w:jc w:val="center"/>
+      </w:pPr>
+      <w:r>
+        <w:rPr>
+          <w:rFonts w:ascii="Times New Roman" w:hAnsi="Times New Roman" w:eastAsia="Times New Roman" w:cs="Times New Roman"/>
+          <w:b w:val="0"/>
+          <w:i/>
+          <w:sz w:val="24"/>
+        </w:rPr>
+        <w:t>[ВСТАВИТЬ РИСУНОК: 02-catalog-filters.png]</w:t>
+      </w:r>
+    </w:p>
+    <w:p>
+      <w:pPr>
+        <w:spacing w:line="240" w:lineRule="auto" w:before="0" w:after="240"/>
+        <w:ind w:firstLine="0"/>
+        <w:jc w:val="center"/>
+      </w:pPr>
+      <w:r>
+        <w:rPr>
+          <w:rFonts w:ascii="Times New Roman" w:hAnsi="Times New Roman" w:eastAsia="Times New Roman" w:cs="Times New Roman"/>
+          <w:b w:val="0"/>
+          <w:i w:val="0"/>
+          <w:sz w:val="24"/>
+        </w:rPr>
+        <w:t>Рис. 5. Каталог изданий с фильтрами по категории и типу</w:t>
+      </w:r>
+    </w:p>
+    <w:p>
+      <w:r>
+        <w:rPr>
+          <w:rFonts w:ascii="Times New Roman" w:hAnsi="Times New Roman" w:eastAsia="Times New Roman" w:cs="Times New Roman"/>
+          <w:b w:val="0"/>
+          <w:i w:val="0"/>
+          <w:sz w:val="28"/>
+        </w:rPr>
+        <w:t>Поиск по названию издания выполняется через тот же эндпоинт с параметром q. На стороне сервера применяется условие ILIKE по полям title_ru и title_uz, что обеспечивает регистро- и языко-независимый поиск. Внешний вид каталога с активным поиском приведён на рисунке 6.</w:t>
+      </w:r>
+    </w:p>
+    <w:p>
+      <w:pPr>
+        <w:spacing w:before="120" w:after="0"/>
+        <w:ind w:firstLine="0"/>
+        <w:jc w:val="center"/>
+      </w:pPr>
+      <w:r>
+        <w:rPr>
+          <w:rFonts w:ascii="Times New Roman" w:hAnsi="Times New Roman" w:eastAsia="Times New Roman" w:cs="Times New Roman"/>
+          <w:b w:val="0"/>
+          <w:i/>
+          <w:sz w:val="24"/>
+        </w:rPr>
+        <w:t>[ВСТАВИТЬ РИСУНОК: 03-catalog-search.png]</w:t>
+      </w:r>
+    </w:p>
+    <w:p>
+      <w:pPr>
+        <w:spacing w:line="240" w:lineRule="auto" w:before="0" w:after="240"/>
+        <w:ind w:firstLine="0"/>
+        <w:jc w:val="center"/>
+      </w:pPr>
+      <w:r>
+        <w:rPr>
+          <w:rFonts w:ascii="Times New Roman" w:hAnsi="Times New Roman" w:eastAsia="Times New Roman" w:cs="Times New Roman"/>
+          <w:b w:val="0"/>
+          <w:i w:val="0"/>
+          <w:sz w:val="24"/>
+        </w:rPr>
+        <w:t>Рис. 6. Каталог изданий с поиском по названию</w:t>
+      </w:r>
+    </w:p>
+    <w:p>
+      <w:r>
+        <w:rPr>
+          <w:rFonts w:ascii="Times New Roman" w:hAnsi="Times New Roman" w:eastAsia="Times New Roman" w:cs="Times New Roman"/>
+          <w:b w:val="0"/>
+          <w:i w:val="0"/>
+          <w:sz w:val="28"/>
+        </w:rPr>
+        <w:t>Карточка издания открывается по адресу /publications/:slug и содержит обложку, описание, выбор срока подписки (один, три, шесть или двенадцать месяцев), расчётную стоимость и кнопку перехода к оформлению. Превью последних трёх номеров выводится ниже описания и формирует представление о содержании издания. Внешний вид карточки приведён на рисунке 7.</w:t>
+      </w:r>
+    </w:p>
+    <w:p>
+      <w:pPr>
+        <w:spacing w:before="120" w:after="0"/>
+        <w:ind w:firstLine="0"/>
+        <w:jc w:val="center"/>
+      </w:pPr>
+      <w:r>
+        <w:rPr>
+          <w:rFonts w:ascii="Times New Roman" w:hAnsi="Times New Roman" w:eastAsia="Times New Roman" w:cs="Times New Roman"/>
+          <w:b w:val="0"/>
+          <w:i/>
+          <w:sz w:val="24"/>
+        </w:rPr>
+        <w:t>[ВСТАВИТЬ РИСУНОК: 04-publication-detail.png]</w:t>
+      </w:r>
+    </w:p>
+    <w:p>
+      <w:pPr>
+        <w:spacing w:line="240" w:lineRule="auto" w:before="0" w:after="240"/>
+        <w:ind w:firstLine="0"/>
+        <w:jc w:val="center"/>
+      </w:pPr>
+      <w:r>
+        <w:rPr>
+          <w:rFonts w:ascii="Times New Roman" w:hAnsi="Times New Roman" w:eastAsia="Times New Roman" w:cs="Times New Roman"/>
+          <w:b w:val="0"/>
+          <w:i w:val="0"/>
+          <w:sz w:val="24"/>
+        </w:rPr>
+        <w:t>Рис. 7. Карточка издания с выбором срока подписки</w:t>
+      </w:r>
+    </w:p>
+    <w:p>
+      <w:r>
+        <w:rPr>
+          <w:rFonts w:ascii="Times New Roman" w:hAnsi="Times New Roman" w:eastAsia="Times New Roman" w:cs="Times New Roman"/>
+          <w:b w:val="0"/>
+          <w:i w:val="0"/>
+          <w:sz w:val="28"/>
+        </w:rPr>
+        <w:t>Регистрация выполняется на странице /register формой с полями ФИО, электронная почта, телефон и пароль. Сервер хеширует пароль по алгоритму bcrypt с десятью раундами соли, сохраняет запись в таблицу users с ролью reader и возвращает токен JSON Web Token со сроком жизни 30 дней. Вход выполняется на странице /login и проверяет пароль через сравнение хешей. Внешний вид форм регистрации и входа приведён на рисунке 8.</w:t>
+      </w:r>
+    </w:p>
+    <w:p>
+      <w:pPr>
+        <w:spacing w:before="120" w:after="0"/>
+        <w:ind w:firstLine="0"/>
+        <w:jc w:val="center"/>
+      </w:pPr>
+      <w:r>
+        <w:rPr>
+          <w:rFonts w:ascii="Times New Roman" w:hAnsi="Times New Roman" w:eastAsia="Times New Roman" w:cs="Times New Roman"/>
+          <w:b w:val="0"/>
+          <w:i/>
+          <w:sz w:val="24"/>
+        </w:rPr>
+        <w:t>[ВСТАВИТЬ РИСУНОК: 05-auth.png]</w:t>
+      </w:r>
+    </w:p>
+    <w:p>
+      <w:pPr>
+        <w:spacing w:line="240" w:lineRule="auto" w:before="0" w:after="240"/>
+        <w:ind w:firstLine="0"/>
+        <w:jc w:val="center"/>
+      </w:pPr>
+      <w:r>
+        <w:rPr>
+          <w:rFonts w:ascii="Times New Roman" w:hAnsi="Times New Roman" w:eastAsia="Times New Roman" w:cs="Times New Roman"/>
+          <w:b w:val="0"/>
+          <w:i w:val="0"/>
+          <w:sz w:val="24"/>
+        </w:rPr>
+        <w:t>Рис. 8. Формы регистрации и входа</w:t>
+      </w:r>
+    </w:p>
+    <w:p>
+      <w:pPr>
+        <w:pStyle w:val="Heading2"/>
+      </w:pPr>
+      <w:r>
+        <w:rPr>
+          <w:rFonts w:ascii="Times New Roman" w:hAnsi="Times New Roman" w:eastAsia="Times New Roman" w:cs="Times New Roman"/>
+          <w:b/>
+          <w:i w:val="0"/>
+          <w:sz w:val="28"/>
+        </w:rPr>
+        <w:t>4.3. Личный кабинет читателя</w:t>
+      </w:r>
+    </w:p>
+    <w:p>
+      <w:pPr>
+        <w:ind w:firstLine="709"/>
+      </w:pPr>
+      <w:r>
+        <w:rPr>
+          <w:rFonts w:ascii="Times New Roman" w:hAnsi="Times New Roman" w:eastAsia="Times New Roman" w:cs="Times New Roman"/>
+          <w:b w:val="0"/>
+          <w:i w:val="0"/>
+          <w:sz w:val="28"/>
+        </w:rPr>
+        <w:t>Личный кабинет доступен по адресу /account и защищён компонентом ProtectedRoute, который проверяет наличие токена и при его отсутствии перенаправляет на страницу входа. Личный кабинет состоит из четырёх разделов: профиль, мои подписки, архив номеров (внутри карточки подписки) и история платежей.</w:t>
+      </w:r>
+    </w:p>
+    <w:p>
+      <w:r>
+        <w:rPr>
+          <w:rFonts w:ascii="Times New Roman" w:hAnsi="Times New Roman" w:eastAsia="Times New Roman" w:cs="Times New Roman"/>
+          <w:b w:val="0"/>
+          <w:i w:val="0"/>
+          <w:sz w:val="28"/>
+        </w:rPr>
+        <w:t>Раздел профиля выводит текущие данные пользователя и форму их редактирования. Изменение данных отправляется запросом PATCH /api/users/me с проверкой токена и валидацией через библиотеку zod. Внешний вид профиля приведён на рисунке 9.</w:t>
+      </w:r>
+    </w:p>
+    <w:p>
+      <w:pPr>
+        <w:spacing w:before="120" w:after="0"/>
+        <w:ind w:firstLine="0"/>
+        <w:jc w:val="center"/>
+      </w:pPr>
+      <w:r>
+        <w:rPr>
+          <w:rFonts w:ascii="Times New Roman" w:hAnsi="Times New Roman" w:eastAsia="Times New Roman" w:cs="Times New Roman"/>
+          <w:b w:val="0"/>
+          <w:i/>
+          <w:sz w:val="24"/>
+        </w:rPr>
+        <w:t>[ВСТАВИТЬ РИСУНОК: 06-account-profile.png]</w:t>
+      </w:r>
+    </w:p>
+    <w:p>
+      <w:pPr>
+        <w:spacing w:line="240" w:lineRule="auto" w:before="0" w:after="240"/>
+        <w:ind w:firstLine="0"/>
+        <w:jc w:val="center"/>
+      </w:pPr>
+      <w:r>
+        <w:rPr>
+          <w:rFonts w:ascii="Times New Roman" w:hAnsi="Times New Roman" w:eastAsia="Times New Roman" w:cs="Times New Roman"/>
+          <w:b w:val="0"/>
+          <w:i w:val="0"/>
+          <w:sz w:val="24"/>
+        </w:rPr>
+        <w:t>Рис. 9. Личный кабинет — профиль</w:t>
+      </w:r>
+    </w:p>
+    <w:p>
+      <w:r>
+        <w:rPr>
+          <w:rFonts w:ascii="Times New Roman" w:hAnsi="Times New Roman" w:eastAsia="Times New Roman" w:cs="Times New Roman"/>
+          <w:b w:val="0"/>
+          <w:i w:val="0"/>
+          <w:sz w:val="28"/>
+        </w:rPr>
+        <w:t>Раздел «Мои подписки» выводит список подписок пользователя со статусами и сроками. Запрос GET /api/subscriptions возвращает записи из таблицы subscriptions, отфильтрованные по user_id из токена. Активные подписки выделены цветом, истёкшие выводятся в отдельной группе. Кнопки «Продлить» и «Отменить» доступны только в соответствующих статусах. Внешний вид раздела приведён на рисунке 10.</w:t>
+      </w:r>
+    </w:p>
+    <w:p>
+      <w:pPr>
+        <w:spacing w:before="120" w:after="0"/>
+        <w:ind w:firstLine="0"/>
+        <w:jc w:val="center"/>
+      </w:pPr>
+      <w:r>
+        <w:rPr>
+          <w:rFonts w:ascii="Times New Roman" w:hAnsi="Times New Roman" w:eastAsia="Times New Roman" w:cs="Times New Roman"/>
+          <w:b w:val="0"/>
+          <w:i/>
+          <w:sz w:val="24"/>
+        </w:rPr>
+        <w:t>[ВСТАВИТЬ РИСУНОК: 07-my-subscriptions.png]</w:t>
+      </w:r>
+    </w:p>
+    <w:p>
+      <w:pPr>
+        <w:spacing w:line="240" w:lineRule="auto" w:before="0" w:after="240"/>
+        <w:ind w:firstLine="0"/>
+        <w:jc w:val="center"/>
+      </w:pPr>
+      <w:r>
+        <w:rPr>
+          <w:rFonts w:ascii="Times New Roman" w:hAnsi="Times New Roman" w:eastAsia="Times New Roman" w:cs="Times New Roman"/>
+          <w:b w:val="0"/>
+          <w:i w:val="0"/>
+          <w:sz w:val="24"/>
+        </w:rPr>
+        <w:t>Рис. 10. Мои подписки</w:t>
+      </w:r>
+    </w:p>
+    <w:p>
+      <w:r>
+        <w:rPr>
+          <w:rFonts w:ascii="Times New Roman" w:hAnsi="Times New Roman" w:eastAsia="Times New Roman" w:cs="Times New Roman"/>
+          <w:b w:val="0"/>
+          <w:i w:val="0"/>
+          <w:sz w:val="28"/>
+        </w:rPr>
+        <w:t>Архив номеров открывается из карточки подписки и содержит список выпусков издания, доступных на дату подписки. Запрос GET /api/subscriptions/:id возвращает запись подписки и связанный список номеров с подписанными ссылками на PDF в Vercel Blob. Сервер перед выдачей ссылки повторно проверяет, что подписка пользователя на это издание имеет статус active и end_date не ранее текущей даты. Внешний вид архива приведён на рисунке 11.</w:t>
+      </w:r>
+    </w:p>
+    <w:p>
+      <w:pPr>
+        <w:spacing w:before="120" w:after="0"/>
+        <w:ind w:firstLine="0"/>
+        <w:jc w:val="center"/>
+      </w:pPr>
+      <w:r>
+        <w:rPr>
+          <w:rFonts w:ascii="Times New Roman" w:hAnsi="Times New Roman" w:eastAsia="Times New Roman" w:cs="Times New Roman"/>
+          <w:b w:val="0"/>
+          <w:i/>
+          <w:sz w:val="24"/>
+        </w:rPr>
+        <w:t>[ВСТАВИТЬ РИСУНОК: 08-archive.png]</w:t>
+      </w:r>
+    </w:p>
+    <w:p>
+      <w:pPr>
+        <w:spacing w:line="240" w:lineRule="auto" w:before="0" w:after="240"/>
+        <w:ind w:firstLine="0"/>
+        <w:jc w:val="center"/>
+      </w:pPr>
+      <w:r>
+        <w:rPr>
+          <w:rFonts w:ascii="Times New Roman" w:hAnsi="Times New Roman" w:eastAsia="Times New Roman" w:cs="Times New Roman"/>
+          <w:b w:val="0"/>
+          <w:i w:val="0"/>
+          <w:sz w:val="24"/>
+        </w:rPr>
+        <w:t>Рис. 11. Архив номеров активной подписки</w:t>
+      </w:r>
+    </w:p>
+    <w:p>
+      <w:r>
+        <w:rPr>
+          <w:rFonts w:ascii="Times New Roman" w:hAnsi="Times New Roman" w:eastAsia="Times New Roman" w:cs="Times New Roman"/>
+          <w:b w:val="0"/>
+          <w:i w:val="0"/>
+          <w:sz w:val="28"/>
+        </w:rPr>
+        <w:t>Оформление подписки выполняется на странице /checkout/:publicationId и содержит сводку заказа (издание, срок, итоговая сумма) и форму имитации оплаты по банковской карте. Поля карты валидируются на клиенте по алгоритму Луна для номера и стандартному формату CVV и срока действия. После отправки запрос POST /api/subscriptions создаёт запись в таблице subscriptions со статусом pending, затем имитирует платёж и при успехе переводит подписку в статус active и сохраняет запись в таблице payments. Внешний вид оформления приведён на рисунке 12.</w:t>
+      </w:r>
+    </w:p>
+    <w:p>
+      <w:pPr>
+        <w:spacing w:before="120" w:after="0"/>
+        <w:ind w:firstLine="0"/>
+        <w:jc w:val="center"/>
+      </w:pPr>
+      <w:r>
+        <w:rPr>
+          <w:rFonts w:ascii="Times New Roman" w:hAnsi="Times New Roman" w:eastAsia="Times New Roman" w:cs="Times New Roman"/>
+          <w:b w:val="0"/>
+          <w:i/>
+          <w:sz w:val="24"/>
+        </w:rPr>
+        <w:t>[ВСТАВИТЬ РИСУНОК: 09-checkout.png]</w:t>
+      </w:r>
+    </w:p>
+    <w:p>
+      <w:pPr>
+        <w:spacing w:line="240" w:lineRule="auto" w:before="0" w:after="240"/>
+        <w:ind w:firstLine="0"/>
+        <w:jc w:val="center"/>
+      </w:pPr>
+      <w:r>
+        <w:rPr>
+          <w:rFonts w:ascii="Times New Roman" w:hAnsi="Times New Roman" w:eastAsia="Times New Roman" w:cs="Times New Roman"/>
+          <w:b w:val="0"/>
+          <w:i w:val="0"/>
+          <w:sz w:val="24"/>
+        </w:rPr>
+        <w:t>Рис. 12. Оформление подписки и имитация оплаты</w:t>
+      </w:r>
+    </w:p>
+    <w:p>
+      <w:r>
+        <w:rPr>
+          <w:rFonts w:ascii="Times New Roman" w:hAnsi="Times New Roman" w:eastAsia="Times New Roman" w:cs="Times New Roman"/>
+          <w:b w:val="0"/>
+          <w:i w:val="0"/>
+          <w:sz w:val="28"/>
+        </w:rPr>
+        <w:t>Раздел «История платежей» выводит хронологический список платежей пользователя с датой, суммой, последними четырьмя цифрами карты и статусом. Запрос GET /api/payments возвращает записи из таблицы payments, отобранные по user_id текущего пользователя через соединение с таблицей subscriptions. Внешний вид раздела приведён на рисунке 13.</w:t>
+      </w:r>
+    </w:p>
+    <w:p>
+      <w:pPr>
+        <w:spacing w:before="120" w:after="0"/>
+        <w:ind w:firstLine="0"/>
+        <w:jc w:val="center"/>
+      </w:pPr>
+      <w:r>
+        <w:rPr>
+          <w:rFonts w:ascii="Times New Roman" w:hAnsi="Times New Roman" w:eastAsia="Times New Roman" w:cs="Times New Roman"/>
+          <w:b w:val="0"/>
+          <w:i/>
+          <w:sz w:val="24"/>
+        </w:rPr>
+        <w:t>[ВСТАВИТЬ РИСУНОК: 10-payments-history.png]</w:t>
+      </w:r>
+    </w:p>
+    <w:p>
+      <w:pPr>
+        <w:spacing w:line="240" w:lineRule="auto" w:before="0" w:after="240"/>
+        <w:ind w:firstLine="0"/>
+        <w:jc w:val="center"/>
+      </w:pPr>
+      <w:r>
+        <w:rPr>
+          <w:rFonts w:ascii="Times New Roman" w:hAnsi="Times New Roman" w:eastAsia="Times New Roman" w:cs="Times New Roman"/>
+          <w:b w:val="0"/>
+          <w:i w:val="0"/>
+          <w:sz w:val="24"/>
+        </w:rPr>
+        <w:t>Рис. 13. История платежей пользователя</w:t>
+      </w:r>
+    </w:p>
+    <w:p>
+      <w:pPr>
+        <w:pStyle w:val="Heading2"/>
+      </w:pPr>
+      <w:r>
+        <w:rPr>
+          <w:rFonts w:ascii="Times New Roman" w:hAnsi="Times New Roman" w:eastAsia="Times New Roman" w:cs="Times New Roman"/>
+          <w:b/>
+          <w:i w:val="0"/>
+          <w:sz w:val="28"/>
+        </w:rPr>
+        <w:t>4.4. Административная панель</w:t>
+      </w:r>
+    </w:p>
+    <w:p>
+      <w:pPr>
+        <w:ind w:firstLine="709"/>
+      </w:pPr>
+      <w:r>
+        <w:rPr>
+          <w:rFonts w:ascii="Times New Roman" w:hAnsi="Times New Roman" w:eastAsia="Times New Roman" w:cs="Times New Roman"/>
+          <w:b w:val="0"/>
+          <w:i w:val="0"/>
+          <w:sz w:val="28"/>
+        </w:rPr>
+        <w:t>Административная панель доступна по адресу /admin и защищена компонентом AdminRoute, который проверяет, что роль пользователя в токене равна admin. На уровне сервера каждая функция в директории /api/admin использует обёртку withAuth с параметром role равным admin, что предотвращает прямой обход защиты в обход клиентской маршрутизации.</w:t>
+      </w:r>
+    </w:p>
+    <w:p>
+      <w:r>
+        <w:rPr>
+          <w:rFonts w:ascii="Times New Roman" w:hAnsi="Times New Roman" w:eastAsia="Times New Roman" w:cs="Times New Roman"/>
+          <w:b w:val="0"/>
+          <w:i w:val="0"/>
+          <w:sz w:val="28"/>
+        </w:rPr>
+        <w:t>Дашборд сводит ключевые метрики: общее число пользователей, число активных подписок, доход за последний месяц и число опубликованных номеров. Метрики получаются запросом GET /api/admin/stats, на стороне сервера агрегирующим данные через SQL-функции COUNT и SUM с условиями по статусу подписки и временным интервалам. Внешний вид дашборда приведён на рисунке 14.</w:t>
+      </w:r>
+    </w:p>
+    <w:p>
+      <w:pPr>
+        <w:spacing w:before="120" w:after="0"/>
+        <w:ind w:firstLine="0"/>
+        <w:jc w:val="center"/>
+      </w:pPr>
+      <w:r>
+        <w:rPr>
+          <w:rFonts w:ascii="Times New Roman" w:hAnsi="Times New Roman" w:eastAsia="Times New Roman" w:cs="Times New Roman"/>
+          <w:b w:val="0"/>
+          <w:i/>
+          <w:sz w:val="24"/>
+        </w:rPr>
+        <w:t>[ВСТАВИТЬ РИСУНОК: 11-admin-dashboard.png]</w:t>
+      </w:r>
+    </w:p>
+    <w:p>
+      <w:pPr>
+        <w:spacing w:line="240" w:lineRule="auto" w:before="0" w:after="240"/>
+        <w:ind w:firstLine="0"/>
+        <w:jc w:val="center"/>
+      </w:pPr>
+      <w:r>
+        <w:rPr>
+          <w:rFonts w:ascii="Times New Roman" w:hAnsi="Times New Roman" w:eastAsia="Times New Roman" w:cs="Times New Roman"/>
+          <w:b w:val="0"/>
+          <w:i w:val="0"/>
+          <w:sz w:val="24"/>
+        </w:rPr>
+        <w:t>Рис. 14. Административный дашборд с метриками</w:t>
+      </w:r>
+    </w:p>
+    <w:p>
+      <w:r>
+        <w:rPr>
+          <w:rFonts w:ascii="Times New Roman" w:hAnsi="Times New Roman" w:eastAsia="Times New Roman" w:cs="Times New Roman"/>
+          <w:b w:val="0"/>
+          <w:i w:val="0"/>
+          <w:sz w:val="28"/>
+        </w:rPr>
+        <w:t>Раздел «Издания» выводит таблицу всех изданий с фильтром по категории и поиском. Каждая строка содержит обложку, название на двух языках, цену, статус публикации и действия (редактировать, управлять номерами, удалить). Запрос GET /api/admin/publications возвращает полный список без ограничения по is_published, что отличает административную выдачу от публичной. Внешний вид раздела приведён на рисунке 15.</w:t>
+      </w:r>
+    </w:p>
+    <w:p>
+      <w:pPr>
+        <w:spacing w:before="120" w:after="0"/>
+        <w:ind w:firstLine="0"/>
+        <w:jc w:val="center"/>
+      </w:pPr>
+      <w:r>
+        <w:rPr>
+          <w:rFonts w:ascii="Times New Roman" w:hAnsi="Times New Roman" w:eastAsia="Times New Roman" w:cs="Times New Roman"/>
+          <w:b w:val="0"/>
+          <w:i/>
+          <w:sz w:val="24"/>
+        </w:rPr>
+        <w:t>[ВСТАВИТЬ РИСУНОК: 12-admin-publications.png]</w:t>
+      </w:r>
+    </w:p>
+    <w:p>
+      <w:pPr>
+        <w:spacing w:line="240" w:lineRule="auto" w:before="0" w:after="240"/>
+        <w:ind w:firstLine="0"/>
+        <w:jc w:val="center"/>
+      </w:pPr>
+      <w:r>
+        <w:rPr>
+          <w:rFonts w:ascii="Times New Roman" w:hAnsi="Times New Roman" w:eastAsia="Times New Roman" w:cs="Times New Roman"/>
+          <w:b w:val="0"/>
+          <w:i w:val="0"/>
+          <w:sz w:val="24"/>
+        </w:rPr>
+        <w:t>Рис. 15. Список изданий в административной панели</w:t>
+      </w:r>
+    </w:p>
+    <w:p>
+      <w:r>
+        <w:rPr>
+          <w:rFonts w:ascii="Times New Roman" w:hAnsi="Times New Roman" w:eastAsia="Times New Roman" w:cs="Times New Roman"/>
+          <w:b w:val="0"/>
+          <w:i w:val="0"/>
+          <w:sz w:val="28"/>
+        </w:rPr>
+        <w:t>Форма редактирования издания позволяет задать поля title_ru, title_uz, description_ru, description_uz, выбрать категорию из выпадающего списка, указать тип издания, цену и флаг публикации. Обложка загружается напрямую в Vercel Blob по подписанному URL, полученному от эндпоинта POST /api/admin/blob/upload-url, после чего ссылка на загруженный файл сохраняется в поле cover_url. Внешний вид формы приведён на рисунке 16.</w:t>
+      </w:r>
+    </w:p>
+    <w:p>
+      <w:pPr>
+        <w:spacing w:before="120" w:after="0"/>
+        <w:ind w:firstLine="0"/>
+        <w:jc w:val="center"/>
+      </w:pPr>
+      <w:r>
+        <w:rPr>
+          <w:rFonts w:ascii="Times New Roman" w:hAnsi="Times New Roman" w:eastAsia="Times New Roman" w:cs="Times New Roman"/>
+          <w:b w:val="0"/>
+          <w:i/>
+          <w:sz w:val="24"/>
+        </w:rPr>
+        <w:t>[ВСТАВИТЬ РИСУНОК: 13-admin-publication-edit.png]</w:t>
+      </w:r>
+    </w:p>
+    <w:p>
+      <w:pPr>
+        <w:spacing w:line="240" w:lineRule="auto" w:before="0" w:after="240"/>
+        <w:ind w:firstLine="0"/>
+        <w:jc w:val="center"/>
+      </w:pPr>
+      <w:r>
+        <w:rPr>
+          <w:rFonts w:ascii="Times New Roman" w:hAnsi="Times New Roman" w:eastAsia="Times New Roman" w:cs="Times New Roman"/>
+          <w:b w:val="0"/>
+          <w:i w:val="0"/>
+          <w:sz w:val="24"/>
+        </w:rPr>
+        <w:t>Рис. 16. Форма редактирования издания</w:t>
+      </w:r>
+    </w:p>
+    <w:p>
+      <w:r>
+        <w:rPr>
+          <w:rFonts w:ascii="Times New Roman" w:hAnsi="Times New Roman" w:eastAsia="Times New Roman" w:cs="Times New Roman"/>
+          <w:b w:val="0"/>
+          <w:i w:val="0"/>
+          <w:sz w:val="28"/>
+        </w:rPr>
+        <w:t>Раздел управления номерами доступен из карточки издания и позволяет загружать новые выпуски. Загрузка PDF-файла выполняется также через подписанный URL Vercel Blob, что разгружает бессерверную функцию от трафика и исключает превышение лимита на размер тела запроса. После успешной загрузки клиент отправляет POST /api/admin/issues с метаданными выпуска (номер, дата публикации, заголовки на двух языках, ссылки на файл и обложку), и запись добавляется в таблицу issues. Внешний вид раздела приведён на рисунке 17.</w:t>
+      </w:r>
+    </w:p>
+    <w:p>
+      <w:pPr>
+        <w:spacing w:before="120" w:after="0"/>
+        <w:ind w:firstLine="0"/>
+        <w:jc w:val="center"/>
+      </w:pPr>
+      <w:r>
+        <w:rPr>
+          <w:rFonts w:ascii="Times New Roman" w:hAnsi="Times New Roman" w:eastAsia="Times New Roman" w:cs="Times New Roman"/>
+          <w:b w:val="0"/>
+          <w:i/>
+          <w:sz w:val="24"/>
+        </w:rPr>
+        <w:t>[ВСТАВИТЬ РИСУНОК: 14-admin-issues.png]</w:t>
+      </w:r>
+    </w:p>
+    <w:p>
+      <w:pPr>
+        <w:spacing w:line="240" w:lineRule="auto" w:before="0" w:after="240"/>
+        <w:ind w:firstLine="0"/>
+        <w:jc w:val="center"/>
+      </w:pPr>
+      <w:r>
+        <w:rPr>
+          <w:rFonts w:ascii="Times New Roman" w:hAnsi="Times New Roman" w:eastAsia="Times New Roman" w:cs="Times New Roman"/>
+          <w:b w:val="0"/>
+          <w:i w:val="0"/>
+          <w:sz w:val="24"/>
+        </w:rPr>
+        <w:t>Рис. 17. Управление номерами и загрузка PDF</w:t>
+      </w:r>
+    </w:p>
+    <w:p>
+      <w:pPr>
+        <w:pStyle w:val="Heading2"/>
+      </w:pPr>
+      <w:r>
+        <w:rPr>
+          <w:rFonts w:ascii="Times New Roman" w:hAnsi="Times New Roman" w:eastAsia="Times New Roman" w:cs="Times New Roman"/>
+          <w:b/>
+          <w:i w:val="0"/>
+          <w:sz w:val="28"/>
+        </w:rPr>
+        <w:t>4.5. Безопасность и контроль доступа</w:t>
+      </w:r>
+    </w:p>
+    <w:p>
+      <w:r>
+        <w:rPr>
+          <w:rFonts w:ascii="Times New Roman" w:hAnsi="Times New Roman" w:eastAsia="Times New Roman" w:cs="Times New Roman"/>
+          <w:b w:val="0"/>
+          <w:i w:val="0"/>
+          <w:sz w:val="28"/>
+        </w:rPr>
+        <w:t>Аутентификация реализована на основе JSON Web Token. Токен выдаётся при успешном входе или регистрации, подписывается секретным ключом по алгоритму HS256 и содержит идентификатор пользователя, роль и время истечения. Срок жизни токена составляет 30 дней. Каждая защищённая функция /api проверяет подпись токена и при необходимости — роль пользователя.</w:t>
+      </w:r>
+    </w:p>
+    <w:p>
+      <w:r>
+        <w:rPr>
+          <w:rFonts w:ascii="Times New Roman" w:hAnsi="Times New Roman" w:eastAsia="Times New Roman" w:cs="Times New Roman"/>
+          <w:b w:val="0"/>
+          <w:i w:val="0"/>
+          <w:sz w:val="28"/>
+        </w:rPr>
+        <w:t>Пароли пользователей хранятся в виде хешей по алгоритму bcrypt с десятью раундами соли. Прямое сравнение паролей и хранение паролей в открытом виде в системе отсутствуют. Полный номер банковской карты не сохраняется в базе данных в соответствии с требованиями стандарта PCI DSS — сохраняются только последние четыре цифры в поле card_last4 таблицы payments. Защита персональных данных пользователей соответствует Закону Республики Узбекистан № ЗРУ-547 от 2 июля 2019 года «О персональных данных», устанавливающему требования к обработке и хранению персональных данных граждан [7].</w:t>
+      </w:r>
+    </w:p>
+    <w:p>
+      <w:pPr>
+        <w:pStyle w:val="Heading2"/>
+      </w:pPr>
+      <w:r>
+        <w:rPr>
+          <w:rFonts w:ascii="Times New Roman" w:hAnsi="Times New Roman" w:eastAsia="Times New Roman" w:cs="Times New Roman"/>
+          <w:b/>
+          <w:i w:val="0"/>
+          <w:sz w:val="28"/>
+        </w:rPr>
+        <w:t>4.6. Локализация интерфейса</w:t>
+      </w:r>
+    </w:p>
+    <w:p>
+      <w:r>
+        <w:rPr>
+          <w:rFonts w:ascii="Times New Roman" w:hAnsi="Times New Roman" w:eastAsia="Times New Roman" w:cs="Times New Roman"/>
+          <w:b w:val="0"/>
+          <w:i w:val="0"/>
+          <w:sz w:val="28"/>
+        </w:rPr>
+        <w:t>Интерфейс приложения переведён на два языка — русский и узбекский. Перевод реализован через библиотеку react-i18next: строки интерфейса хранятся в файлах src/locales/ru.json и src/locales/uz.json и обращаются по ключам через хук useTranslation. Контент изданий переводится через парные двуязычные колонки title_ru / title_uz, description_ru / description_uz, name_ru / name_uz в таблицах базы данных. Выбранный язык сохраняется в локальном хранилище браузера и применяется при следующем визите. Переключатель языка вынесен в шапку приложения [10].</w:t>
+      </w:r>
+    </w:p>
+    <w:p>
+      <w:pPr>
+        <w:pStyle w:val="Heading1"/>
+        <w:jc w:val="center"/>
+      </w:pPr>
+      <w:r>
+        <w:rPr>
+          <w:rFonts w:ascii="Times New Roman" w:hAnsi="Times New Roman" w:eastAsia="Times New Roman" w:cs="Times New Roman"/>
+          <w:b/>
+          <w:i w:val="0"/>
+          <w:sz w:val="28"/>
+        </w:rPr>
+        <w:t>ЗАКЛЮЧЕНИЕ</w:t>
+      </w:r>
+    </w:p>
+    <w:p>
+      <w:r>
+        <w:rPr>
+          <w:rFonts w:ascii="Times New Roman" w:hAnsi="Times New Roman" w:eastAsia="Times New Roman" w:cs="Times New Roman"/>
+          <w:b w:val="0"/>
+          <w:i w:val="0"/>
+          <w:sz w:val="28"/>
+        </w:rPr>
+        <w:t>В проектной работе спроектирована и реализована информационная система электронной подписки на газеты и журналы. Система ориентирована на рынок Республики Узбекистан и поддерживает работу с контентом на русском и узбекском языках. Готовое приложение развёрнуто на платформе Vercel и доступно по адресу https://ilhom-oj9x.vercel.app/.</w:t>
+      </w:r>
+    </w:p>
+    <w:p>
+      <w:r>
+        <w:rPr>
+          <w:rFonts w:ascii="Times New Roman" w:hAnsi="Times New Roman" w:eastAsia="Times New Roman" w:cs="Times New Roman"/>
+          <w:b w:val="0"/>
+          <w:i w:val="0"/>
+          <w:sz w:val="28"/>
+        </w:rPr>
+        <w:t>В ходе работы выполнен анализ предметной области. Рассмотрены отечественные сервисы (Pochta.uz, davr-online.uz) и зарубежные аналоги (Readly, Magzter, PressReader), составлена сравнительная таблица их функциональных возможностей. Выявлена ниша для комплексного веб-решения, которое объединяет национальный каталог изданий, оплату в национальной валюте и стандартную модель цифровой подписки.</w:t>
+      </w:r>
+    </w:p>
+    <w:p>
+      <w:r>
+        <w:rPr>
+          <w:rFonts w:ascii="Times New Roman" w:hAnsi="Times New Roman" w:eastAsia="Times New Roman" w:cs="Times New Roman"/>
+          <w:b w:val="0"/>
+          <w:i w:val="0"/>
+          <w:sz w:val="28"/>
+        </w:rPr>
+        <w:t>Обоснован выбор технологического стека. Клиентская часть построена на React 18, TypeScript, Vite и TailwindCSS. Серверная часть реализована на бессерверных функциях платформы Vercel. В качестве базы данных используется управляемый PostgreSQL версии 16 от провайдера Neon. PDF-номера и обложки изданий хранятся в Vercel Blob. Аутентификация построена на JSON Web Token и алгоритме хеширования паролей bcrypt. Двуязычность обеспечена библиотекой react-i18next и парными колонками в базе данных. Выбранные технологии позволяют развернуть систему на бесплатных тарифах облачных провайдеров без аренды собственных серверов.</w:t>
+      </w:r>
+    </w:p>
+    <w:p>
+      <w:r>
+        <w:rPr>
+          <w:rFonts w:ascii="Times New Roman" w:hAnsi="Times New Roman" w:eastAsia="Times New Roman" w:cs="Times New Roman"/>
+          <w:b w:val="0"/>
+          <w:i w:val="0"/>
+          <w:sz w:val="28"/>
+        </w:rPr>
+        <w:t>Спроектирована реляционная база данных из шести таблиц: users, categories, publications, issues, subscriptions, payments. Соблюдены правила нормализации до третьей нормальной формы, построены вторичные индексы для часто исполняемых запросов каталога и личного кабинета. Описан жизненный цикл подписки с четырьмя состояниями pending, active, expired и cancelled. Контроль доступа к PDF-номерам реализован на стороне сервера через проверку статуса и срока действия подписки.</w:t>
+      </w:r>
+    </w:p>
+    <w:p>
+      <w:r>
+        <w:rPr>
+          <w:rFonts w:ascii="Times New Roman" w:hAnsi="Times New Roman" w:eastAsia="Times New Roman" w:cs="Times New Roman"/>
+          <w:b w:val="0"/>
+          <w:i w:val="0"/>
+          <w:sz w:val="28"/>
+        </w:rPr>
+        <w:t>Реализована публичная часть приложения с главной страницей, каталогом изданий, карточкой издания и формами регистрации и входа. Реализован личный кабинет читателя с разделами «Профиль», «Мои подписки», архивом номеров и историей платежей. Реализована административная панель с дашбордом, управлением изданиями и загрузкой PDF-номеров через прямую загрузку в файловое хранилище. Поставленные в начале работы задачи выполнены в полном объёме.</w:t>
+      </w:r>
+    </w:p>
+    <w:p>
+      <w:r>
+        <w:rPr>
+          <w:rFonts w:ascii="Times New Roman" w:hAnsi="Times New Roman" w:eastAsia="Times New Roman" w:cs="Times New Roman"/>
+          <w:b w:val="0"/>
+          <w:i w:val="0"/>
+          <w:sz w:val="28"/>
+        </w:rPr>
+        <w:t>Перспективы развития системы связаны с расширением функциональных возможностей и интеграциями. Предусматривается подключение реальных платёжных провайдеров узбекского рынка (Click, Payme, Uzcard) вместо имитации оплаты, разработка мобильного приложения на основе React Native, добавление полнотекстового поиска по содержимому PDF-номеров через PostgreSQL Full Text Search, внедрение рекомендательной системы на основе истории просмотров, подключение push-уведомлений о выходе новых номеров и приближении даты окончания подписки. Перечисленные направления опираются на действующую архитектуру и не требуют её существенной перестройки.</w:t>
+      </w:r>
+    </w:p>
+    <w:p>
+      <w:pPr>
+        <w:pStyle w:val="Heading1"/>
+        <w:jc w:val="center"/>
+      </w:pPr>
+      <w:r>
+        <w:rPr>
+          <w:rFonts w:ascii="Times New Roman" w:hAnsi="Times New Roman" w:eastAsia="Times New Roman" w:cs="Times New Roman"/>
+          <w:b/>
+          <w:i w:val="0"/>
+          <w:sz w:val="28"/>
+        </w:rPr>
+        <w:t>ИСПОЛЬЗОВАННЫЕ ИСТОЧНИКИ</w:t>
+      </w:r>
+    </w:p>
+    <w:p>
+      <w:pPr>
+        <w:pStyle w:val="Heading2"/>
+      </w:pPr>
+      <w:r>
+        <w:rPr>
+          <w:rFonts w:ascii="Times New Roman" w:hAnsi="Times New Roman" w:eastAsia="Times New Roman" w:cs="Times New Roman"/>
+          <w:b/>
+          <w:i w:val="0"/>
+          <w:sz w:val="28"/>
+        </w:rPr>
+        <w:t>1. Акты и Законы</w:t>
+      </w:r>
+    </w:p>
+    <w:p>
+      <w:pPr>
+        <w:spacing w:line="360" w:lineRule="auto"/>
+        <w:ind w:firstLine="0" w:left="425"/>
+        <w:jc w:val="both"/>
+      </w:pPr>
+      <w:r>
+        <w:rPr>
+          <w:rFonts w:ascii="Times New Roman" w:hAnsi="Times New Roman" w:eastAsia="Times New Roman" w:cs="Times New Roman"/>
+          <w:b w:val="0"/>
+          <w:i w:val="0"/>
+          <w:sz w:val="28"/>
+        </w:rPr>
+        <w:t>1. Закон Республики Узбекистан № 541 от 15.01.2007 «О средствах массовой информации» (действующая редакция). — Ташкент: Национальная база данных законодательства lex.uz, 2024.</w:t>
+      </w:r>
+    </w:p>
+    <w:p>
+      <w:pPr>
+        <w:spacing w:line="360" w:lineRule="auto"/>
+        <w:ind w:firstLine="0" w:left="425"/>
+        <w:jc w:val="both"/>
+      </w:pPr>
+      <w:r>
+        <w:rPr>
+          <w:rFonts w:ascii="Times New Roman" w:hAnsi="Times New Roman" w:eastAsia="Times New Roman" w:cs="Times New Roman"/>
+          <w:b w:val="0"/>
+          <w:i w:val="0"/>
+          <w:sz w:val="28"/>
+        </w:rPr>
+        <w:t>2. Указ Президента Республики Узбекистан № УП-6079 от 05.10.2020 «Об утверждении Стратегии «Цифровой Узбекистан — 2030». — Ташкент: lex.uz, 2020.</w:t>
+      </w:r>
+    </w:p>
+    <w:p>
+      <w:pPr>
+        <w:spacing w:line="360" w:lineRule="auto"/>
+        <w:ind w:firstLine="0" w:left="425"/>
+        <w:jc w:val="both"/>
+      </w:pPr>
+      <w:r>
+        <w:rPr>
+          <w:rFonts w:ascii="Times New Roman" w:hAnsi="Times New Roman" w:eastAsia="Times New Roman" w:cs="Times New Roman"/>
+          <w:b w:val="0"/>
+          <w:i w:val="0"/>
+          <w:sz w:val="28"/>
+        </w:rPr>
+        <w:t>3. Закон Республики Узбекистан № ЗРУ-560 от 24.04.2019 «О связи». — Ташкент: lex.uz, 2019.</w:t>
+      </w:r>
+    </w:p>
+    <w:p>
+      <w:pPr>
+        <w:spacing w:line="360" w:lineRule="auto"/>
+        <w:ind w:firstLine="0" w:left="425"/>
+        <w:jc w:val="both"/>
+      </w:pPr>
+      <w:r>
+        <w:rPr>
+          <w:rFonts w:ascii="Times New Roman" w:hAnsi="Times New Roman" w:eastAsia="Times New Roman" w:cs="Times New Roman"/>
+          <w:b w:val="0"/>
+          <w:i w:val="0"/>
+          <w:sz w:val="28"/>
+        </w:rPr>
+        <w:t>4. Постановление Президента Республики Узбекистан № ПП-3832 от 20.06.2018 «О мерах по дальнейшему совершенствованию информационной сферы». — Ташкент: lex.uz, 2018.</w:t>
+      </w:r>
+    </w:p>
+    <w:p>
+      <w:pPr>
+        <w:spacing w:line="360" w:lineRule="auto"/>
+        <w:ind w:firstLine="0" w:left="425"/>
+        <w:jc w:val="both"/>
+      </w:pPr>
+      <w:r>
+        <w:rPr>
+          <w:rFonts w:ascii="Times New Roman" w:hAnsi="Times New Roman" w:eastAsia="Times New Roman" w:cs="Times New Roman"/>
+          <w:b w:val="0"/>
+          <w:i w:val="0"/>
+          <w:sz w:val="28"/>
+        </w:rPr>
+        <w:t>5. Закон Республики Узбекистан № ЗРУ-547 от 02.07.2019 «О персональных данных». — Ташкент: lex.uz, 2022 (с изменениями).</w:t>
+      </w:r>
+    </w:p>
+    <w:p>
+      <w:pPr>
+        <w:spacing w:line="360" w:lineRule="auto"/>
+        <w:ind w:firstLine="0" w:left="425"/>
+        <w:jc w:val="both"/>
+      </w:pPr>
+      <w:r>
+        <w:rPr>
+          <w:rFonts w:ascii="Times New Roman" w:hAnsi="Times New Roman" w:eastAsia="Times New Roman" w:cs="Times New Roman"/>
+          <w:b w:val="0"/>
+          <w:i w:val="0"/>
+          <w:sz w:val="28"/>
+        </w:rPr>
+        <w:t>6. Закон Республики Узбекистан № ЗРУ-764 от 14.04.2022 «Об электронной коммерции». — Ташкент: lex.uz, 2022.</w:t>
+      </w:r>
+    </w:p>
+    <w:p>
+      <w:pPr>
+        <w:spacing w:line="360" w:lineRule="auto"/>
+        <w:ind w:firstLine="0" w:left="425"/>
+        <w:jc w:val="both"/>
+      </w:pPr>
+      <w:r>
+        <w:rPr>
+          <w:rFonts w:ascii="Times New Roman" w:hAnsi="Times New Roman" w:eastAsia="Times New Roman" w:cs="Times New Roman"/>
+          <w:b w:val="0"/>
+          <w:i w:val="0"/>
+          <w:sz w:val="28"/>
+        </w:rPr>
+        <w:t>7. Постановление Президента Республики Узбекистан № ПП-201 от 31.03.2022 «О дополнительных мерах по ускоренному внедрению цифровых технологий в государственном управлении». — Ташкент: lex.uz, 2022.</w:t>
+      </w:r>
+    </w:p>
+    <w:p>
+      <w:pPr>
+        <w:pStyle w:val="Heading2"/>
+      </w:pPr>
+      <w:r>
+        <w:rPr>
+          <w:rFonts w:ascii="Times New Roman" w:hAnsi="Times New Roman" w:eastAsia="Times New Roman" w:cs="Times New Roman"/>
+          <w:b/>
+          <w:i w:val="0"/>
+          <w:sz w:val="28"/>
+        </w:rPr>
+        <w:t>2. Научные статьи, монографии, учебные пособия</w:t>
+      </w:r>
+    </w:p>
+    <w:p>
+      <w:pPr>
+        <w:spacing w:line="360" w:lineRule="auto"/>
+        <w:ind w:firstLine="0" w:left="425"/>
+        <w:jc w:val="both"/>
+      </w:pPr>
+      <w:r>
+        <w:rPr>
+          <w:rFonts w:ascii="Times New Roman" w:hAnsi="Times New Roman" w:eastAsia="Times New Roman" w:cs="Times New Roman"/>
+          <w:b w:val="0"/>
+          <w:i w:val="0"/>
+          <w:sz w:val="28"/>
+        </w:rPr>
+        <w:t>8. Newman, S. Building Microservices: Designing Fine-Grained Systems. — 2nd ed. — Sebastopol: O’Reilly Media, 2021. — 612 p.</w:t>
+      </w:r>
+    </w:p>
+    <w:p>
+      <w:pPr>
+        <w:spacing w:line="360" w:lineRule="auto"/>
+        <w:ind w:firstLine="0" w:left="425"/>
+        <w:jc w:val="both"/>
+      </w:pPr>
+      <w:r>
+        <w:rPr>
+          <w:rFonts w:ascii="Times New Roman" w:hAnsi="Times New Roman" w:eastAsia="Times New Roman" w:cs="Times New Roman"/>
+          <w:b w:val="0"/>
+          <w:i w:val="0"/>
+          <w:sz w:val="28"/>
+        </w:rPr>
+        <w:t>9. Banks, A., Porcello, E. Learning React: Modern Patterns for Developing React Apps. — 2nd ed. — Sebastopol: O’Reilly Media, 2021. — 310 p.</w:t>
+      </w:r>
+    </w:p>
+    <w:p>
+      <w:pPr>
+        <w:spacing w:line="360" w:lineRule="auto"/>
+        <w:ind w:firstLine="0" w:left="425"/>
+        <w:jc w:val="both"/>
+      </w:pPr>
+      <w:r>
+        <w:rPr>
+          <w:rFonts w:ascii="Times New Roman" w:hAnsi="Times New Roman" w:eastAsia="Times New Roman" w:cs="Times New Roman"/>
+          <w:b w:val="0"/>
+          <w:i w:val="0"/>
+          <w:sz w:val="28"/>
+        </w:rPr>
+        <w:t>10. Sheth, A. Serverless Applications with Node.js. — Boston: Pearson, 2021. — 280 p.</w:t>
+      </w:r>
+    </w:p>
+    <w:p>
+      <w:pPr>
+        <w:spacing w:line="360" w:lineRule="auto"/>
+        <w:ind w:firstLine="0" w:left="425"/>
+        <w:jc w:val="both"/>
+      </w:pPr>
+      <w:r>
+        <w:rPr>
+          <w:rFonts w:ascii="Times New Roman" w:hAnsi="Times New Roman" w:eastAsia="Times New Roman" w:cs="Times New Roman"/>
+          <w:b w:val="0"/>
+          <w:i w:val="0"/>
+          <w:sz w:val="28"/>
+        </w:rPr>
+        <w:t>11. Mardan, A. Practical Node.js: Building Real-World Scalable Web Apps. — 2nd ed. — Berkeley: Apress, 2022. — 410 p.</w:t>
+      </w:r>
+    </w:p>
+    <w:p>
+      <w:pPr>
+        <w:spacing w:line="360" w:lineRule="auto"/>
+        <w:ind w:firstLine="0" w:left="425"/>
+        <w:jc w:val="both"/>
+      </w:pPr>
+      <w:r>
+        <w:rPr>
+          <w:rFonts w:ascii="Times New Roman" w:hAnsi="Times New Roman" w:eastAsia="Times New Roman" w:cs="Times New Roman"/>
+          <w:b w:val="0"/>
+          <w:i w:val="0"/>
+          <w:sz w:val="28"/>
+        </w:rPr>
+        <w:t>12. Wieruch, R. The Road to React: Your Journey to Master Plain Yet Pragmatic React. — Leanpub, 2024. — 358 p.</w:t>
+      </w:r>
+    </w:p>
+    <w:p>
+      <w:pPr>
+        <w:spacing w:line="360" w:lineRule="auto"/>
+        <w:ind w:firstLine="0" w:left="425"/>
+        <w:jc w:val="both"/>
+      </w:pPr>
+      <w:r>
+        <w:rPr>
+          <w:rFonts w:ascii="Times New Roman" w:hAnsi="Times New Roman" w:eastAsia="Times New Roman" w:cs="Times New Roman"/>
+          <w:b w:val="0"/>
+          <w:i w:val="0"/>
+          <w:sz w:val="28"/>
+        </w:rPr>
+        <w:t>13. Бадд, Э. CSS3. Стильный сайт своими руками. — СПб.: Питер, 2022. — 384 с.</w:t>
+      </w:r>
+    </w:p>
+    <w:p>
+      <w:pPr>
+        <w:spacing w:line="360" w:lineRule="auto"/>
+        <w:ind w:firstLine="0" w:left="425"/>
+        <w:jc w:val="both"/>
+      </w:pPr>
+      <w:r>
+        <w:rPr>
+          <w:rFonts w:ascii="Times New Roman" w:hAnsi="Times New Roman" w:eastAsia="Times New Roman" w:cs="Times New Roman"/>
+          <w:b w:val="0"/>
+          <w:i w:val="0"/>
+          <w:sz w:val="28"/>
+        </w:rPr>
+        <w:t>14. Орлов, С. А. Технологии разработки программного обеспечения. — СПб.: Питер, 2022. — 608 с.</w:t>
+      </w:r>
+    </w:p>
+    <w:p>
+      <w:pPr>
+        <w:spacing w:line="360" w:lineRule="auto"/>
+        <w:ind w:firstLine="0" w:left="425"/>
+        <w:jc w:val="both"/>
+      </w:pPr>
+      <w:r>
+        <w:rPr>
+          <w:rFonts w:ascii="Times New Roman" w:hAnsi="Times New Roman" w:eastAsia="Times New Roman" w:cs="Times New Roman"/>
+          <w:b w:val="0"/>
+          <w:i w:val="0"/>
+          <w:sz w:val="28"/>
+        </w:rPr>
+        <w:t>15. Колисниченко, Д. Н. PostgreSQL. Основы языка SQL. — СПб.: БХВ-Петербург, 2023. — 432 с.</w:t>
+      </w:r>
+    </w:p>
+    <w:p>
+      <w:pPr>
+        <w:spacing w:line="360" w:lineRule="auto"/>
+        <w:ind w:firstLine="0" w:left="425"/>
+        <w:jc w:val="both"/>
+      </w:pPr>
+      <w:r>
+        <w:rPr>
+          <w:rFonts w:ascii="Times New Roman" w:hAnsi="Times New Roman" w:eastAsia="Times New Roman" w:cs="Times New Roman"/>
+          <w:b w:val="0"/>
+          <w:i w:val="0"/>
+          <w:sz w:val="28"/>
+        </w:rPr>
+        <w:t>16. Шнейдер, Б. Проектирование интерфейса: стратегии эффективного взаимодействия человек-компьютер. — М.: Вильямс, 2021. — 656 с.</w:t>
+      </w:r>
+    </w:p>
+    <w:p>
+      <w:pPr>
+        <w:pStyle w:val="Heading2"/>
+      </w:pPr>
+      <w:r>
+        <w:rPr>
+          <w:rFonts w:ascii="Times New Roman" w:hAnsi="Times New Roman" w:eastAsia="Times New Roman" w:cs="Times New Roman"/>
+          <w:b/>
+          <w:i w:val="0"/>
+          <w:sz w:val="28"/>
+        </w:rPr>
+        <w:t>3. Технические стандарты и интернет-ресурсы</w:t>
+      </w:r>
+    </w:p>
+    <w:p>
+      <w:pPr>
+        <w:spacing w:line="360" w:lineRule="auto"/>
+        <w:ind w:firstLine="0" w:left="425"/>
+        <w:jc w:val="both"/>
+      </w:pPr>
+      <w:r>
+        <w:rPr>
+          <w:rFonts w:ascii="Times New Roman" w:hAnsi="Times New Roman" w:eastAsia="Times New Roman" w:cs="Times New Roman"/>
+          <w:b w:val="0"/>
+          <w:i w:val="0"/>
+          <w:sz w:val="28"/>
+        </w:rPr>
+        <w:t>17. PostgreSQL 16 Documentation. — The PostgreSQL Global Development Group, 2024. — URL: https://www.postgresql.org/docs/16/ (дата обращения 2026-04-30).</w:t>
+      </w:r>
+    </w:p>
+    <w:p>
+      <w:pPr>
+        <w:spacing w:line="360" w:lineRule="auto"/>
+        <w:ind w:firstLine="0" w:left="425"/>
+        <w:jc w:val="both"/>
+      </w:pPr>
+      <w:r>
+        <w:rPr>
+          <w:rFonts w:ascii="Times New Roman" w:hAnsi="Times New Roman" w:eastAsia="Times New Roman" w:cs="Times New Roman"/>
+          <w:b w:val="0"/>
+          <w:i w:val="0"/>
+          <w:sz w:val="28"/>
+        </w:rPr>
+        <w:t>18. React Documentation. — Meta Open Source, 2024. — URL: https://react.dev/ (дата обращения 2026-04-30).</w:t>
+      </w:r>
+    </w:p>
+    <w:p>
+      <w:pPr>
+        <w:spacing w:line="360" w:lineRule="auto"/>
+        <w:ind w:firstLine="0" w:left="425"/>
+        <w:jc w:val="both"/>
+      </w:pPr>
+      <w:r>
+        <w:rPr>
+          <w:rFonts w:ascii="Times New Roman" w:hAnsi="Times New Roman" w:eastAsia="Times New Roman" w:cs="Times New Roman"/>
+          <w:b w:val="0"/>
+          <w:i w:val="0"/>
+          <w:sz w:val="28"/>
+        </w:rPr>
+        <w:t>19. MDN Web Docs. — Mozilla Foundation, 2024. — URL: https://developer.mozilla.org/ (дата обращения 2026-04-30).</w:t>
+      </w:r>
+    </w:p>
+    <w:p>
+      <w:pPr>
+        <w:spacing w:line="360" w:lineRule="auto"/>
+        <w:ind w:firstLine="0" w:left="425"/>
+        <w:jc w:val="both"/>
+      </w:pPr>
+      <w:r>
+        <w:rPr>
+          <w:rFonts w:ascii="Times New Roman" w:hAnsi="Times New Roman" w:eastAsia="Times New Roman" w:cs="Times New Roman"/>
+          <w:b w:val="0"/>
+          <w:i w:val="0"/>
+          <w:sz w:val="28"/>
+        </w:rPr>
+        <w:t>20. Vercel Documentation. — Vercel Inc., 2024. — URL: https://vercel.com/docs (дата обращения 2026-04-30).</w:t>
+      </w:r>
+    </w:p>
+    <w:p>
+      <w:pPr>
+        <w:spacing w:line="360" w:lineRule="auto"/>
+        <w:ind w:firstLine="0" w:left="425"/>
+        <w:jc w:val="both"/>
+      </w:pPr>
+      <w:r>
+        <w:rPr>
+          <w:rFonts w:ascii="Times New Roman" w:hAnsi="Times New Roman" w:eastAsia="Times New Roman" w:cs="Times New Roman"/>
+          <w:b w:val="0"/>
+          <w:i w:val="0"/>
+          <w:sz w:val="28"/>
+        </w:rPr>
+        <w:t>21. Neon Documentation. — Neon Inc., 2024. — URL: https://neon.tech/docs (дата обращения 2026-04-30).</w:t>
+      </w:r>
+    </w:p>
+    <w:p>
+      <w:pPr>
+        <w:spacing w:line="360" w:lineRule="auto"/>
+        <w:ind w:firstLine="0" w:left="425"/>
+        <w:jc w:val="both"/>
+      </w:pPr>
+      <w:r>
+        <w:rPr>
+          <w:rFonts w:ascii="Times New Roman" w:hAnsi="Times New Roman" w:eastAsia="Times New Roman" w:cs="Times New Roman"/>
+          <w:b w:val="0"/>
+          <w:i w:val="0"/>
+          <w:sz w:val="28"/>
+        </w:rPr>
+        <w:t>22. TailwindCSS Documentation. — Tailwind Labs, 2024. — URL: https://tailwindcss.com/docs (дата обращения 2026-04-30).</w:t>
+      </w:r>
+    </w:p>
+    <w:p>
+      <w:pPr>
+        <w:spacing w:line="360" w:lineRule="auto"/>
+        <w:ind w:firstLine="0" w:left="425"/>
+        <w:jc w:val="both"/>
+      </w:pPr>
+      <w:r>
+        <w:rPr>
+          <w:rFonts w:ascii="Times New Roman" w:hAnsi="Times New Roman" w:eastAsia="Times New Roman" w:cs="Times New Roman"/>
+          <w:b w:val="0"/>
+          <w:i w:val="0"/>
+          <w:sz w:val="28"/>
+        </w:rPr>
+        <w:t>23. TypeScript Handbook. — Microsoft Corporation, 2024. — URL: https://www.typescriptlang.org/docs/ (дата обращения 2026-04-30).</w:t>
+      </w:r>
+    </w:p>
+    <w:p>
+      <w:pPr>
+        <w:spacing w:line="360" w:lineRule="auto"/>
+        <w:ind w:firstLine="0" w:left="425"/>
+        <w:jc w:val="both"/>
+      </w:pPr>
+      <w:r>
+        <w:rPr>
+          <w:rFonts w:ascii="Times New Roman" w:hAnsi="Times New Roman" w:eastAsia="Times New Roman" w:cs="Times New Roman"/>
+          <w:b w:val="0"/>
+          <w:i w:val="0"/>
+          <w:sz w:val="28"/>
+        </w:rPr>
+        <w:t>24. OWASP Top Ten Web Application Security Risks. — Open Worldwide Application Security Project, 2021. — URL: https://owasp.org/Top10/ (дата обращения 2026-04-30).</w:t>
+      </w:r>
+    </w:p>
+    <w:p>
+      <w:pPr>
+        <w:spacing w:line="360" w:lineRule="auto"/>
+        <w:ind w:firstLine="0" w:left="425"/>
+        <w:jc w:val="both"/>
+      </w:pPr>
+      <w:r>
+        <w:rPr>
+          <w:rFonts w:ascii="Times New Roman" w:hAnsi="Times New Roman" w:eastAsia="Times New Roman" w:cs="Times New Roman"/>
+          <w:b w:val="0"/>
+          <w:i w:val="0"/>
+          <w:sz w:val="28"/>
+        </w:rPr>
+        <w:t>25. RFC 7519. JSON Web Token (JWT). — Internet Engineering Task Force, 2015. — URL: https://datatracker.ietf.org/doc/html/rfc7519 (дата обращения 2026-04-30).</w:t>
       </w:r>
     </w:p>
     <w:sectPr>

</xml_diff>